<commit_message>
fix(bieu-mau): Mẫu 9D theo bố cục bản chuẩn — bảng tiêu đề, quý La Mã, chức vụ 3 dòng
- Template 9D (script mới tools/templates/fix_mau9d_layout.py, chạy lại an toàn): "Mẫu số 09D"; tiêu đề trang là bảng
  2 cột không viền (ĐẢNG BỘ … / CHI BỘ … đậm | ĐẢNG CỘNG SẢN VIỆT NAM đậm, gạch ngắn dưới); bỏ dòng địa danh – ngày
  (ORG_LOCATION, DATE_LINE) và dấu "*" thừa; chức vụ 3 dòng Đảng / chính quyền / đoàn thể thẳng hàng; đơn vị công tác
  kèm tên công ty (ORG_COMPANY_NAME); lề trang và số trang đầu trang như bản chuẩn.
- Mau9DData: bỏ DateLine, POSITIONS → PARTY_POSITION/ADMIN_POSITION/MASS_POSITION (không có chức vụ trong danh mục thì
  dòng chính quyền dùng chức danh trên hồ sơ); quý in số La Mã ("QUÝ III").
- fix_form_tags.py không thêm DATE_LINE cho 9D nữa; cập nhật docs/bieu-mau.md và unit test.
</commit_message>
<xml_diff>
--- a/backend/src/CongTacDang.Infrastructure/Templates/Word/Mau_9D_PhuLucKetQuaNhiemVu.docx
+++ b/backend/src/CongTacDang.Infrastructure/Templates/Word/Mau_9D_PhuLucKetQuaNhiemVu.docx
@@ -4,477 +4,168 @@
   <w:body>
     <w:p>
       <w:pPr>
-        <w:spacing w:before="120" w:after="0" w:line="240" w:lineRule="auto"/>
+        <w:spacing w:before="0" w:after="200" w:line="276" w:lineRule="auto"/>
         <w:jc w:val="right"/>
         <w:rPr>
-          <w:rFonts w:eastAsia="Calibri"/>
-          <w:b/>
-          <w:bCs/>
-          <w:i/>
-          <w:iCs/>
-          <w:kern w:val="2"/>
-          <w:sz w:val="28"/>
-          <w:szCs w:val="28"/>
-          <w:lang w:val="en-US" w:eastAsia="en-US"/>
-          <w14:ligatures w14:val="standardContextual"/>
+          <w:sz w:val="24"/>
+          <w:szCs w:val="24"/>
         </w:rPr>
       </w:pPr>
       <w:r>
         <w:rPr>
-          <w:rFonts w:eastAsia="Calibri"/>
+          <w:rFonts w:ascii="Times New Roman" w:hAnsi="Times New Roman" w:cs="Times New Roman"/>
           <w:b/>
-          <w:bCs/>
           <w:i/>
-          <w:iCs/>
-          <w:kern w:val="2"/>
-          <w:sz w:val="28"/>
-          <w:szCs w:val="28"/>
-          <w:lang w:val="en-US" w:eastAsia="en-US"/>
-          <w14:ligatures w14:val="standardContextual"/>
+          <w:sz w:val="24"/>
+          <w:szCs w:val="24"/>
         </w:rPr>
-        <w:lastRenderedPageBreak/>
-        <w:t>Mẫu 9D</w:t>
+        <w:t xml:space="preserve">Mẫu số 09D</w:t>
       </w:r>
     </w:p>
+    <w:tbl>
+      <w:tblPr>
+        <w:tblW w:w="16585" w:type="dxa"/>
+        <w:tblInd w:w="-567" w:type="dxa"/>
+        <w:tblBorders>
+          <w:top w:val="nil"/>
+          <w:left w:val="nil"/>
+          <w:bottom w:val="nil"/>
+          <w:right w:val="nil"/>
+          <w:insideH w:val="nil"/>
+          <w:insideV w:val="nil"/>
+        </w:tblBorders>
+        <w:tblLayout w:type="fixed"/>
+        <w:tblCellMar>
+          <w:left w:w="108" w:type="dxa"/>
+          <w:right w:w="108" w:type="dxa"/>
+        </w:tblCellMar>
+        <w:tblLook w:val="0000" w:firstRow="0" w:lastRow="0" w:firstColumn="0" w:lastColumn="0" w:noHBand="0" w:noVBand="0"/>
+      </w:tblPr>
+      <w:tblGrid>
+        <w:gridCol w:w="6946"/>
+        <w:gridCol w:w="9639"/>
+      </w:tblGrid>
+      <w:tr>
+        <w:trPr>
+          <w:trHeight w:val="710"/>
+        </w:trPr>
+        <w:tc>
+          <w:tcPr>
+            <w:tcW w:w="6946" w:type="dxa"/>
+          </w:tcPr>
+          <w:p>
+            <w:pPr>
+              <w:spacing w:before="0" w:after="0" w:line="240" w:lineRule="auto"/>
+              <w:jc w:val="center"/>
+              <w:rPr>
+                <w:sz w:val="26"/>
+                <w:szCs w:val="26"/>
+              </w:rPr>
+            </w:pPr>
+            <w:sdt>
+              <w:sdtPr>
+                <w:alias w:val="ORG_PARTY_NAME"/>
+                <w:tag w:val="ORG_PARTY_NAME"/>
+                <w:id w:val="924000"/>
+              </w:sdtPr>
+              <w:sdtContent>
+                <w:r>
+                  <w:rPr>
+                    <w:rFonts w:ascii="Times New Roman" w:hAnsi="Times New Roman" w:cs="Times New Roman"/>
+                    <w:sz w:val="26"/>
+                    <w:szCs w:val="26"/>
+                  </w:rPr>
+                  <w:t xml:space="preserve">ĐẢNG BỘ….</w:t>
+                </w:r>
+              </w:sdtContent>
+            </w:sdt>
+          </w:p>
+          <w:p>
+            <w:pPr>
+              <w:spacing w:before="0" w:after="0" w:line="240" w:lineRule="auto"/>
+              <w:jc w:val="center"/>
+              <w:rPr>
+                <w:sz w:val="26"/>
+                <w:szCs w:val="26"/>
+              </w:rPr>
+            </w:pPr>
+            <w:sdt>
+              <w:sdtPr>
+                <w:alias w:val="PARTY_CELL"/>
+                <w:tag w:val="PARTY_CELL"/>
+                <w:id w:val="924001"/>
+              </w:sdtPr>
+              <w:sdtContent>
+                <w:r>
+                  <w:rPr>
+                    <w:rFonts w:ascii="Times New Roman" w:hAnsi="Times New Roman" w:cs="Times New Roman"/>
+                    <w:b/>
+                    <w:sz w:val="26"/>
+                    <w:szCs w:val="26"/>
+                  </w:rPr>
+                  <w:t xml:space="preserve">CHI BỘ…</w:t>
+                </w:r>
+              </w:sdtContent>
+            </w:sdt>
+          </w:p>
+          <w:p>
+            <w:pPr>
+              <w:pBdr>
+                <w:top w:val="single" w:sz="6" w:space="1" w:color="000000"/>
+              </w:pBdr>
+              <w:spacing w:before="60" w:after="0" w:line="120" w:lineRule="exact"/>
+              <w:ind w:left="2270" w:right="2270"/>
+              <w:jc w:val="center"/>
+              <w:rPr>
+                <w:sz w:val="8"/>
+                <w:szCs w:val="8"/>
+              </w:rPr>
+            </w:pPr>
+          </w:p>
+        </w:tc>
+        <w:tc>
+          <w:tcPr>
+            <w:tcW w:w="9639" w:type="dxa"/>
+          </w:tcPr>
+          <w:p>
+            <w:pPr>
+              <w:spacing w:before="0" w:after="0" w:line="240" w:lineRule="auto"/>
+              <w:jc w:val="center"/>
+              <w:rPr>
+                <w:sz w:val="26"/>
+                <w:szCs w:val="26"/>
+              </w:rPr>
+            </w:pPr>
+            <w:r>
+              <w:rPr>
+                <w:rFonts w:ascii="Times New Roman" w:hAnsi="Times New Roman" w:cs="Times New Roman"/>
+                <w:b/>
+                <w:sz w:val="26"/>
+                <w:szCs w:val="26"/>
+              </w:rPr>
+              <w:t xml:space="preserve">ĐẢNG CỘNG SẢN VIỆT NAM</w:t>
+            </w:r>
+          </w:p>
+          <w:p>
+            <w:pPr>
+              <w:pBdr>
+                <w:top w:val="single" w:sz="6" w:space="1" w:color="000000"/>
+              </w:pBdr>
+              <w:spacing w:before="60" w:after="0" w:line="120" w:lineRule="exact"/>
+              <w:ind w:left="3339" w:right="3339"/>
+              <w:jc w:val="center"/>
+              <w:rPr>
+                <w:sz w:val="8"/>
+                <w:szCs w:val="8"/>
+              </w:rPr>
+            </w:pPr>
+          </w:p>
+        </w:tc>
+      </w:tr>
+    </w:tbl>
     <w:p>
       <w:pPr>
-        <w:spacing w:before="120" w:after="0" w:line="240" w:lineRule="auto"/>
-        <w:jc w:val="left"/>
-        <w:rPr>
-          <w:rFonts w:eastAsia="Calibri"/>
-          <w:b/>
-          <w:bCs/>
-          <w:kern w:val="2"/>
-          <w:sz w:val="28"/>
-          <w:szCs w:val="28"/>
-          <w:u w:val="single"/>
-          <w:lang w:val="en-US" w:eastAsia="en-US"/>
-          <w14:ligatures w14:val="standardContextual"/>
-        </w:rPr>
-      </w:pPr>
-      <w:sdt>
-        <w:sdtPr>
-          <w:alias w:val="ORG_PARTY_NAME"/>
-          <w:tag w:val="ORG_PARTY_NAME"/>
-          <w:id w:val="924000"/>
-        </w:sdtPr>
-        <w:sdtContent>
-          <w:r>
-            <w:rPr>
-              <w:rFonts w:eastAsia="Calibri"/>
-              <w:kern w:val="2"/>
-              <w:sz w:val="28"/>
-              <w:szCs w:val="28"/>
-              <w:lang w:val="en-US" w:eastAsia="en-US"/>
-              <w14:ligatures w14:val="standardContextual"/>
-            </w:rPr>
-            <w:t xml:space="preserve">ĐẢNG BỘ….</w:t>
-          </w:r>
-        </w:sdtContent>
-      </w:sdt>
-      <w:r>
-        <w:rPr>
-          <w:rFonts w:eastAsia="Calibri"/>
-          <w:b/>
-          <w:bCs/>
-          <w:kern w:val="2"/>
-          <w:sz w:val="28"/>
-          <w:szCs w:val="28"/>
-          <w:lang w:val="en-US" w:eastAsia="en-US"/>
-          <w14:ligatures w14:val="standardContextual"/>
-        </w:rPr>
-        <w:tab/>
-      </w:r>
-      <w:r>
-        <w:rPr>
-          <w:rFonts w:eastAsia="Calibri"/>
-          <w:b/>
-          <w:bCs/>
-          <w:kern w:val="2"/>
-          <w:sz w:val="28"/>
-          <w:szCs w:val="28"/>
-          <w:lang w:val="en-US" w:eastAsia="en-US"/>
-          <w14:ligatures w14:val="standardContextual"/>
-        </w:rPr>
-        <w:tab/>
-      </w:r>
-      <w:r>
-        <w:rPr>
-          <w:rFonts w:eastAsia="Calibri"/>
-          <w:b/>
-          <w:bCs/>
-          <w:kern w:val="2"/>
-          <w:sz w:val="28"/>
-          <w:szCs w:val="28"/>
-          <w:lang w:val="en-US" w:eastAsia="en-US"/>
-          <w14:ligatures w14:val="standardContextual"/>
-        </w:rPr>
-        <w:tab/>
-      </w:r>
-      <w:r>
-        <w:rPr>
-          <w:rFonts w:eastAsia="Calibri"/>
-          <w:b/>
-          <w:bCs/>
-          <w:kern w:val="2"/>
-          <w:sz w:val="28"/>
-          <w:szCs w:val="28"/>
-          <w:lang w:val="en-US" w:eastAsia="en-US"/>
-          <w14:ligatures w14:val="standardContextual"/>
-        </w:rPr>
-        <w:tab/>
-      </w:r>
-      <w:r>
-        <w:rPr>
-          <w:rFonts w:eastAsia="Calibri"/>
-          <w:b/>
-          <w:bCs/>
-          <w:kern w:val="2"/>
-          <w:sz w:val="28"/>
-          <w:szCs w:val="28"/>
-          <w:lang w:val="en-US" w:eastAsia="en-US"/>
-          <w14:ligatures w14:val="standardContextual"/>
-        </w:rPr>
-        <w:tab/>
-      </w:r>
-      <w:r>
-        <w:rPr>
-          <w:rFonts w:eastAsia="Calibri"/>
-          <w:b/>
-          <w:bCs/>
-          <w:kern w:val="2"/>
-          <w:sz w:val="28"/>
-          <w:szCs w:val="28"/>
-          <w:lang w:val="en-US" w:eastAsia="en-US"/>
-          <w14:ligatures w14:val="standardContextual"/>
-        </w:rPr>
-        <w:tab/>
-      </w:r>
-      <w:r>
-        <w:rPr>
-          <w:rFonts w:eastAsia="Calibri"/>
-          <w:b/>
-          <w:bCs/>
-          <w:kern w:val="2"/>
-          <w:sz w:val="28"/>
-          <w:szCs w:val="28"/>
-          <w:lang w:val="en-US" w:eastAsia="en-US"/>
-          <w14:ligatures w14:val="standardContextual"/>
-        </w:rPr>
-        <w:tab/>
-      </w:r>
-      <w:r>
-        <w:rPr>
-          <w:rFonts w:eastAsia="Calibri"/>
-          <w:b/>
-          <w:bCs/>
-          <w:kern w:val="2"/>
-          <w:sz w:val="28"/>
-          <w:szCs w:val="28"/>
-          <w:lang w:val="en-US" w:eastAsia="en-US"/>
-          <w14:ligatures w14:val="standardContextual"/>
-        </w:rPr>
-        <w:tab/>
-      </w:r>
-      <w:r>
-        <w:rPr>
-          <w:rFonts w:eastAsia="Calibri"/>
-          <w:b/>
-          <w:bCs/>
-          <w:kern w:val="2"/>
-          <w:sz w:val="28"/>
-          <w:szCs w:val="28"/>
-          <w:lang w:val="en-US" w:eastAsia="en-US"/>
-          <w14:ligatures w14:val="standardContextual"/>
-        </w:rPr>
-        <w:tab/>
-      </w:r>
-      <w:r>
-        <w:rPr>
-          <w:rFonts w:eastAsia="Calibri"/>
-          <w:b/>
-          <w:bCs/>
-          <w:kern w:val="2"/>
-          <w:sz w:val="28"/>
-          <w:szCs w:val="28"/>
-          <w:lang w:val="en-US" w:eastAsia="en-US"/>
-          <w14:ligatures w14:val="standardContextual"/>
-        </w:rPr>
-        <w:tab/>
-      </w:r>
-      <w:r>
-        <w:rPr>
-          <w:rFonts w:eastAsia="Calibri"/>
-          <w:b/>
-          <w:bCs/>
-          <w:kern w:val="2"/>
-          <w:sz w:val="28"/>
-          <w:szCs w:val="28"/>
-          <w:u w:val="single"/>
-          <w:lang w:val="en-US" w:eastAsia="en-US"/>
-          <w14:ligatures w14:val="standardContextual"/>
-        </w:rPr>
-        <w:t>ĐẢNG CỘNG SẢN VIỆT NAM</w:t>
-      </w:r>
-    </w:p>
-    <w:p>
-      <w:pPr>
-        <w:spacing w:before="120" w:after="0" w:line="240" w:lineRule="auto"/>
-        <w:jc w:val="left"/>
-        <w:rPr>
-          <w:rFonts w:eastAsia="Calibri"/>
-          <w:i/>
-          <w:iCs/>
-          <w:kern w:val="2"/>
-          <w:sz w:val="28"/>
-          <w:szCs w:val="28"/>
-          <w:lang w:val="en-US" w:eastAsia="en-US"/>
-          <w14:ligatures w14:val="standardContextual"/>
-        </w:rPr>
-      </w:pPr>
-      <w:sdt>
-        <w:sdtPr>
-          <w:alias w:val="PARTY_CELL"/>
-          <w:tag w:val="PARTY_CELL"/>
-          <w:id w:val="924001"/>
-        </w:sdtPr>
-        <w:sdtContent>
-          <w:r>
-            <w:rPr>
-              <w:rFonts w:eastAsia="Calibri"/>
-              <w:b/>
-              <w:bCs/>
-              <w:kern w:val="2"/>
-              <w:sz w:val="28"/>
-              <w:szCs w:val="28"/>
-              <w:lang w:val="en-US" w:eastAsia="en-US"/>
-              <w14:ligatures w14:val="standardContextual"/>
-            </w:rPr>
-            <w:t xml:space="preserve">CHI BỘ…</w:t>
-          </w:r>
-        </w:sdtContent>
-      </w:sdt>
-      <w:r>
-        <w:rPr>
-          <w:rFonts w:eastAsia="Calibri"/>
-          <w:b/>
-          <w:bCs/>
-          <w:kern w:val="2"/>
-          <w:sz w:val="28"/>
-          <w:szCs w:val="28"/>
-          <w:lang w:val="en-US" w:eastAsia="en-US"/>
-          <w14:ligatures w14:val="standardContextual"/>
-        </w:rPr>
-        <w:tab/>
-      </w:r>
-      <w:r>
-        <w:rPr>
-          <w:rFonts w:eastAsia="Calibri"/>
-          <w:b/>
-          <w:bCs/>
-          <w:kern w:val="2"/>
-          <w:sz w:val="28"/>
-          <w:szCs w:val="28"/>
-          <w:lang w:val="en-US" w:eastAsia="en-US"/>
-          <w14:ligatures w14:val="standardContextual"/>
-        </w:rPr>
-        <w:tab/>
-      </w:r>
-      <w:r>
-        <w:rPr>
-          <w:rFonts w:eastAsia="Calibri"/>
-          <w:b/>
-          <w:bCs/>
-          <w:kern w:val="2"/>
-          <w:sz w:val="28"/>
-          <w:szCs w:val="28"/>
-          <w:lang w:val="en-US" w:eastAsia="en-US"/>
-          <w14:ligatures w14:val="standardContextual"/>
-        </w:rPr>
-        <w:tab/>
-      </w:r>
-      <w:r>
-        <w:rPr>
-          <w:rFonts w:eastAsia="Calibri"/>
-          <w:b/>
-          <w:bCs/>
-          <w:kern w:val="2"/>
-          <w:sz w:val="28"/>
-          <w:szCs w:val="28"/>
-          <w:lang w:val="en-US" w:eastAsia="en-US"/>
-          <w14:ligatures w14:val="standardContextual"/>
-        </w:rPr>
-        <w:tab/>
-      </w:r>
-      <w:r>
-        <w:rPr>
-          <w:rFonts w:eastAsia="Calibri"/>
-          <w:b/>
-          <w:bCs/>
-          <w:kern w:val="2"/>
-          <w:sz w:val="28"/>
-          <w:szCs w:val="28"/>
-          <w:lang w:val="en-US" w:eastAsia="en-US"/>
-          <w14:ligatures w14:val="standardContextual"/>
-        </w:rPr>
-        <w:tab/>
-      </w:r>
-      <w:r>
-        <w:rPr>
-          <w:rFonts w:eastAsia="Calibri"/>
-          <w:b/>
-          <w:bCs/>
-          <w:kern w:val="2"/>
-          <w:sz w:val="28"/>
-          <w:szCs w:val="28"/>
-          <w:lang w:val="en-US" w:eastAsia="en-US"/>
-          <w14:ligatures w14:val="standardContextual"/>
-        </w:rPr>
-        <w:tab/>
-      </w:r>
-      <w:r>
-        <w:rPr>
-          <w:rFonts w:eastAsia="Calibri"/>
-          <w:b/>
-          <w:bCs/>
-          <w:kern w:val="2"/>
-          <w:sz w:val="28"/>
-          <w:szCs w:val="28"/>
-          <w:lang w:val="en-US" w:eastAsia="en-US"/>
-          <w14:ligatures w14:val="standardContextual"/>
-        </w:rPr>
-        <w:tab/>
-      </w:r>
-      <w:r>
-        <w:rPr>
-          <w:rFonts w:eastAsia="Calibri"/>
-          <w:b/>
-          <w:bCs/>
-          <w:kern w:val="2"/>
-          <w:sz w:val="28"/>
-          <w:szCs w:val="28"/>
-          <w:lang w:val="en-US" w:eastAsia="en-US"/>
-          <w14:ligatures w14:val="standardContextual"/>
-        </w:rPr>
-        <w:tab/>
-      </w:r>
-      <w:r>
-        <w:rPr>
-          <w:rFonts w:eastAsia="Calibri"/>
-          <w:b/>
-          <w:bCs/>
-          <w:kern w:val="2"/>
-          <w:sz w:val="28"/>
-          <w:szCs w:val="28"/>
-          <w:lang w:val="en-US" w:eastAsia="en-US"/>
-          <w14:ligatures w14:val="standardContextual"/>
-        </w:rPr>
-        <w:tab/>
-      </w:r>
-      <w:r>
-        <w:rPr>
-          <w:rFonts w:eastAsia="Calibri"/>
-          <w:b/>
-          <w:bCs/>
-          <w:kern w:val="2"/>
-          <w:sz w:val="28"/>
-          <w:szCs w:val="28"/>
-          <w:lang w:val="en-US" w:eastAsia="en-US"/>
-          <w14:ligatures w14:val="standardContextual"/>
-        </w:rPr>
-        <w:tab/>
-        <w:t xml:space="preserve">        </w:t>
-      </w:r>
-      <w:sdt>
-        <w:sdtPr>
-          <w:alias w:val="ORG_LOCATION"/>
-          <w:tag w:val="ORG_LOCATION"/>
-          <w:id w:val="924002"/>
-        </w:sdtPr>
-        <w:sdtContent>
-          <w:r>
-            <w:rPr>
-              <w:rFonts w:eastAsia="Calibri"/>
-              <w:i/>
-              <w:iCs/>
-              <w:kern w:val="2"/>
-              <w:sz w:val="28"/>
-              <w:szCs w:val="28"/>
-              <w:lang w:val="en-US" w:eastAsia="en-US"/>
-              <w14:ligatures w14:val="standardContextual"/>
-            </w:rPr>
-            <w:t xml:space="preserve">……….</w:t>
-          </w:r>
-        </w:sdtContent>
-      </w:sdt>
-      <w:r>
-        <w:rPr>
-          <w:rFonts w:eastAsia="Calibri"/>
-          <w:i/>
-          <w:iCs/>
-          <w:kern w:val="2"/>
-          <w:sz w:val="28"/>
-          <w:szCs w:val="28"/>
-          <w:lang w:val="en-US" w:eastAsia="en-US"/>
-          <w14:ligatures w14:val="standardContextual"/>
-        </w:rPr>
-        <w:t xml:space="preserve">, </w:t>
-      </w:r>
-      <w:sdt>
-        <w:sdtPr>
-          <w:alias w:val="DATE_LINE"/>
-          <w:tag w:val="DATE_LINE"/>
-          <w:id w:val="924020"/>
-        </w:sdtPr>
-        <w:sdtContent>
-          <w:r>
-            <w:rPr>
-              <w:rFonts w:eastAsia="Calibri"/>
-              <w:i/>
-              <w:iCs/>
-              <w:kern w:val="2"/>
-              <w:sz w:val="28"/>
-              <w:szCs w:val="28"/>
-              <w:lang w:val="en-US" w:eastAsia="en-US"/>
-              <w14:ligatures w14:val="standardContextual"/>
-            </w:rPr>
-            <w:t xml:space="preserve">ngày       tháng       năm……...</w:t>
-          </w:r>
-        </w:sdtContent>
-      </w:sdt>
-    </w:p>
-    <w:p>
-      <w:pPr>
-        <w:spacing w:before="120" w:after="0" w:line="240" w:lineRule="auto"/>
-        <w:jc w:val="left"/>
-        <w:rPr>
-          <w:rFonts w:eastAsia="Calibri"/>
-          <w:i/>
-          <w:iCs/>
-          <w:kern w:val="2"/>
-          <w:sz w:val="28"/>
-          <w:szCs w:val="28"/>
-          <w:lang w:val="en-US" w:eastAsia="en-US"/>
-          <w14:ligatures w14:val="standardContextual"/>
-        </w:rPr>
-      </w:pPr>
-      <w:r>
-        <w:rPr>
-          <w:rFonts w:eastAsia="Calibri"/>
-          <w:i/>
-          <w:iCs/>
-          <w:kern w:val="2"/>
-          <w:sz w:val="28"/>
-          <w:szCs w:val="28"/>
-          <w:lang w:val="en-US" w:eastAsia="en-US"/>
-          <w14:ligatures w14:val="standardContextual"/>
-        </w:rPr>
-        <w:t xml:space="preserve">           *</w:t>
-      </w:r>
-    </w:p>
-    <w:p>
-      <w:pPr>
-        <w:spacing w:before="120" w:after="0" w:line="240" w:lineRule="auto"/>
+        <w:spacing w:after="0" w:line="240" w:lineRule="auto"/>
         <w:jc w:val="left"/>
         <w:rPr>
           <w:rFonts w:eastAsia="Calibri"/>
@@ -706,42 +397,110 @@
     <w:p>
       <w:pPr>
         <w:spacing w:before="120" w:after="0" w:line="240" w:lineRule="auto"/>
-        <w:ind w:firstLine="567"/>
+        <w:ind w:left="1656" w:hanging="1089"/>
         <w:rPr>
-          <w:rFonts w:eastAsia="Calibri"/>
-          <w:kern w:val="2"/>
           <w:sz w:val="28"/>
           <w:szCs w:val="28"/>
-          <w:lang w:val="en-US" w:eastAsia="en-US"/>
-          <w14:ligatures w14:val="standardContextual"/>
         </w:rPr>
       </w:pPr>
       <w:r>
         <w:rPr>
-          <w:rFonts w:eastAsia="Calibri"/>
-          <w:kern w:val="2"/>
+          <w:rFonts w:ascii="Times New Roman" w:hAnsi="Times New Roman" w:cs="Times New Roman"/>
           <w:sz w:val="28"/>
           <w:szCs w:val="28"/>
-          <w:lang w:val="en-US" w:eastAsia="en-US"/>
-          <w14:ligatures w14:val="standardContextual"/>
         </w:rPr>
-        <w:t xml:space="preserve">Chức vụ (Đảng, Chính quyền, Đoàn thể): </w:t>
+        <w:t xml:space="preserve">Chức vụ: </w:t>
+      </w:r>
+      <w:r>
+        <w:rPr>
+          <w:rFonts w:ascii="Times New Roman" w:hAnsi="Times New Roman" w:cs="Times New Roman"/>
+          <w:sz w:val="28"/>
+          <w:szCs w:val="28"/>
+        </w:rPr>
+        <w:t xml:space="preserve">Chức vụ Đảng: </w:t>
       </w:r>
       <w:sdt>
         <w:sdtPr>
-          <w:alias w:val="POSITIONS"/>
-          <w:tag w:val="POSITIONS"/>
-          <w:id w:val="924006"/>
+          <w:alias w:val="PARTY_POSITION"/>
+          <w:tag w:val="PARTY_POSITION"/>
+          <w:id w:val="924026"/>
         </w:sdtPr>
         <w:sdtContent>
           <w:r>
             <w:rPr>
-              <w:rFonts w:eastAsia="Calibri"/>
-              <w:kern w:val="2"/>
+              <w:rFonts w:ascii="Times New Roman" w:hAnsi="Times New Roman" w:cs="Times New Roman"/>
               <w:sz w:val="28"/>
               <w:szCs w:val="28"/>
-              <w:lang w:val="en-US" w:eastAsia="en-US"/>
-              <w14:ligatures w14:val="standardContextual"/>
+            </w:rPr>
+            <w:t xml:space="preserve">…</w:t>
+          </w:r>
+        </w:sdtContent>
+      </w:sdt>
+    </w:p>
+    <w:p>
+      <w:pPr>
+        <w:spacing w:before="0" w:after="0" w:line="240" w:lineRule="auto"/>
+        <w:ind w:left="1656"/>
+        <w:rPr>
+          <w:sz w:val="28"/>
+          <w:szCs w:val="28"/>
+        </w:rPr>
+      </w:pPr>
+      <w:r>
+        <w:rPr>
+          <w:rFonts w:ascii="Times New Roman" w:hAnsi="Times New Roman" w:cs="Times New Roman"/>
+          <w:sz w:val="28"/>
+          <w:szCs w:val="28"/>
+        </w:rPr>
+        <w:t xml:space="preserve">Chức vụ chính quyền: </w:t>
+      </w:r>
+      <w:sdt>
+        <w:sdtPr>
+          <w:alias w:val="ADMIN_POSITION"/>
+          <w:tag w:val="ADMIN_POSITION"/>
+          <w:id w:val="924027"/>
+        </w:sdtPr>
+        <w:sdtContent>
+          <w:r>
+            <w:rPr>
+              <w:rFonts w:ascii="Times New Roman" w:hAnsi="Times New Roman" w:cs="Times New Roman"/>
+              <w:sz w:val="28"/>
+              <w:szCs w:val="28"/>
+            </w:rPr>
+            <w:t xml:space="preserve">…</w:t>
+          </w:r>
+        </w:sdtContent>
+      </w:sdt>
+    </w:p>
+    <w:p>
+      <w:pPr>
+        <w:spacing w:before="0" w:after="0" w:line="240" w:lineRule="auto"/>
+        <w:ind w:left="1656"/>
+        <w:rPr>
+          <w:sz w:val="28"/>
+          <w:szCs w:val="28"/>
+        </w:rPr>
+      </w:pPr>
+      <w:r>
+        <w:rPr>
+          <w:rFonts w:ascii="Times New Roman" w:hAnsi="Times New Roman" w:cs="Times New Roman"/>
+          <w:sz w:val="28"/>
+          <w:szCs w:val="28"/>
+        </w:rPr>
+        <w:t xml:space="preserve">Chức vụ đoàn thể: </w:t>
+      </w:r>
+      <w:sdt>
+        <w:sdtPr>
+          <w:alias w:val="MASS_POSITION"/>
+          <w:tag w:val="MASS_POSITION"/>
+          <w:id w:val="924028"/>
+        </w:sdtPr>
+        <w:sdtContent>
+          <w:r>
+            <w:rPr>
+              <w:rFonts w:ascii="Times New Roman" w:hAnsi="Times New Roman" w:cs="Times New Roman"/>
+              <w:sz w:val="28"/>
+              <w:szCs w:val="28"/>
             </w:rPr>
             <w:t xml:space="preserve">…</w:t>
           </w:r>
@@ -787,6 +546,31 @@
               <w:szCs w:val="28"/>
               <w:lang w:val="en-US" w:eastAsia="en-US"/>
               <w14:ligatures w14:val="standardContextual"/>
+            </w:rPr>
+            <w:t xml:space="preserve">…</w:t>
+          </w:r>
+        </w:sdtContent>
+      </w:sdt>
+      <w:r>
+        <w:rPr>
+          <w:rFonts w:ascii="Times New Roman" w:hAnsi="Times New Roman" w:cs="Times New Roman"/>
+          <w:sz w:val="28"/>
+          <w:szCs w:val="28"/>
+        </w:rPr>
+        <w:t xml:space="preserve">, </w:t>
+      </w:r>
+      <w:sdt>
+        <w:sdtPr>
+          <w:alias w:val="ORG_COMPANY_NAME"/>
+          <w:tag w:val="ORG_COMPANY_NAME"/>
+          <w:id w:val="924029"/>
+        </w:sdtPr>
+        <w:sdtContent>
+          <w:r>
+            <w:rPr>
+              <w:rFonts w:ascii="Times New Roman" w:hAnsi="Times New Roman" w:cs="Times New Roman"/>
+              <w:sz w:val="28"/>
+              <w:szCs w:val="28"/>
             </w:rPr>
             <w:t xml:space="preserve">…</w:t>
           </w:r>
@@ -1741,8 +1525,9 @@
       </w:r>
     </w:p>
     <w:sectPr>
+      <w:headerReference w:type="default" r:id="rId8"/>
       <w:pgSz w:w="16838" w:h="11906" w:orient="landscape"/>
-      <w:pgMar w:top="1021" w:right="851" w:bottom="1021" w:left="851" w:header="720" w:footer="720" w:gutter="0"/>
+      <w:pgMar w:top="851" w:right="1021" w:bottom="851" w:left="1021" w:header="720" w:footer="720" w:gutter="0"/>
       <w:cols w:space="720"/>
       <w:docGrid w:linePitch="360"/>
     </w:sectPr>

</xml_diff>